<commit_message>
feat:optimize display logic,change review report sturcture
</commit_message>
<xml_diff>
--- a/mock_word_report.docx
+++ b/mock_word_report.docx
@@ -74,17 +74,17 @@
     </w:p>
     <w:p>
       <w:r>
-        <w:t>风险点六：应收账款余额较大且占增值税全部销售收入比例较高，造成少记增值税应税收入风险</w:t>
+        <w:t>风险点三：应收账款余额较大且占增值税全部销售收入比例较高，造成少记增值税应税收入风险</w:t>
       </w:r>
     </w:p>
     <w:p>
       <w:r>
-        <w:t>中移软件2022年应收账款期末余额为3835157923.58元，增值税全部销售收入为13000689629.13元；2021年该企业应收账款期末余额为2969056392.27元，增值税全部销售收入为7972729629.90元；应收账款余额较大且占增值税销售收入比例较高，且多为关联方应收账款。可能存在未及时确认收入的风险。</w:t>
+        <w:t>A科技有限公司2022年应收账款期末余额为3835157923.58元，增值税全部销售收入为13000689629.13元；2021年该企业应收账款期末余额为2969056392.27元，增值税全部销售收入为7972729629.90元；应收账款余额较大且占增值税销售收入比例较高，且多为关联方应收账款。可能存在未及时确认收入的风险。</w:t>
       </w:r>
     </w:p>
     <w:p>
       <w:r>
-        <w:t>验证情况：增值税计税依据是纳税义务发生时间，而非实际收款时间。经核实，A公司主要交易对象为集团内31省移动公司，因此应收账款多为关联方应收账款。企业应收账款余额主要与集团及31省公司回款进度、回款计划以及合同付款条款约定等有关。暂未发现企业存在应收账款未及时确认收入的风险。</w:t>
+        <w:t>验证情况：增值税计税依据是纳税义务发生时间，而非实际收款时间。经核实，A科技有限公司主要交易对象为集团客户及长期合作客户，因此应收账款多为关联方应收账款。企业应收账款余额主要与主要客户回款进度、回款计划以及合同付款条款约定等有关。暂未发现企业存在应收账款未及时确认收入的风险。</w:t>
       </w:r>
     </w:p>
     <w:p>

</xml_diff>